<commit_message>
Use pateo de balon for the final anatomical sheet
Co-Authored-By: Claude Sonnet 5.5 <noreply@anthropic.com>
Claude-Session: https://claude.ai/code/session_01W5ytguvUBBGTyHeCH4M5HD
</commit_message>
<xml_diff>
--- a/Taller_Bases_Biologicas_Anatomicas_RESUELTO.docx
+++ b/Taller_Bases_Biologicas_Anatomicas_RESUELTO.docx
@@ -1753,7 +1753,7 @@
                 <w:color w:val="1F3A8A"/>
                 <w:sz w:val="20"/>
               </w:rPr>
-              <w:t>Sentadilla (squat) con peso corporal</w:t>
+              <w:t>Pateo de balón (patada frontal con el empeine o borde interno del pie)</w:t>
             </w:r>
           </w:p>
         </w:tc>
@@ -1781,7 +1781,7 @@
             <w:r>
               <w:drawing>
                 <wp:inline xmlns:a="http://schemas.openxmlformats.org/drawingml/2006/main" xmlns:pic="http://schemas.openxmlformats.org/drawingml/2006/picture">
-                  <wp:extent cx="4206240" cy="2463655"/>
+                  <wp:extent cx="4206240" cy="2208276"/>
                   <wp:docPr id="1" name="Picture 1"/>
                   <wp:cNvGraphicFramePr>
                     <a:graphicFrameLocks noChangeAspect="1"/>
@@ -1790,7 +1790,7 @@
                     <a:graphicData uri="http://schemas.openxmlformats.org/drawingml/2006/picture">
                       <pic:pic>
                         <pic:nvPicPr>
-                          <pic:cNvPr id="0" name="squat.png"/>
+                          <pic:cNvPr id="0" name="kick.png"/>
                           <pic:cNvPicPr/>
                         </pic:nvPicPr>
                         <pic:blipFill>
@@ -1802,7 +1802,7 @@
                         <pic:spPr>
                           <a:xfrm>
                             <a:off x="0" y="0"/>
-                            <a:ext cx="4206240" cy="2463655"/>
+                            <a:ext cx="4206240" cy="2208276"/>
                           </a:xfrm>
                           <a:prstGeom prst="rect"/>
                         </pic:spPr>
@@ -1840,7 +1840,7 @@
                 <w:color w:val="1F3A8A"/>
                 <w:sz w:val="20"/>
               </w:rPr>
-              <w:t>Fémur, tibia, peroné, rótula, pelvis (coxal y sacro), columna vertebral (lumbar) y huesos del tarso (astrágalo y calcáneo).</w:t>
+              <w:t>Pelvis (coxal), fémur, rótula, tibia, peroné, huesos del tarso (astrágalo, calcáneo), metatarsianos y falanges; columna lumbar y huesos del pie de apoyo como estabilizadores.</w:t>
             </w:r>
           </w:p>
         </w:tc>
@@ -1870,7 +1870,7 @@
                 <w:color w:val="1F3A8A"/>
                 <w:sz w:val="20"/>
               </w:rPr>
-              <w:t>Coxofemoral (cadera, esferoidea/enartrosis), tibiofemoral y femororrotuliana (rodilla, troclear/bicondílea) y tibioastragalina (tobillo, troclear). Articulaciones intervertebrales lumbares como estabilizadoras.</w:t>
+              <w:t>Coxofemoral (cadera, esferoidea), tibiofemoral y femororrotuliana (rodilla), tibioastragalina (tobillo, fijo en flexión plantar al golpear); en la pierna de apoyo, cadera, rodilla y tobillo estabilizan.</w:t>
             </w:r>
           </w:p>
         </w:tc>
@@ -1900,7 +1900,7 @@
                 <w:color w:val="1F3A8A"/>
                 <w:sz w:val="20"/>
               </w:rPr>
-              <w:t>Cuádriceps (recto femoral, vasto lateral, medial e intermedio), glúteo mayor, isquiotibiales (bíceps femoral, semitendinoso, semimembranoso), aductores, gastrocnemio, sóleo, erectores espinales y abdominales.</w:t>
+              <w:t>Fase preparatoria: glúteo mayor e isquiotibiales (extensión de cadera y flexión de rodilla). Golpeo: iliopsoas y recto femoral (flexión de cadera) y cuádriceps (extensión de rodilla); gastrocnemio y tibial anterior fijan el tobillo. Estabilizan: glúteo medio, aductores, abdominales y erectores espinales.</w:t>
             </w:r>
           </w:p>
         </w:tc>
@@ -1930,7 +1930,7 @@
                 <w:color w:val="1F3A8A"/>
                 <w:sz w:val="20"/>
               </w:rPr>
-              <w:t>Descenso: flexión de cadera y rodilla con dorsiflexión del tobillo (cadena cinética cerrada). Ascenso: extensión de cadera y rodilla con flexión plantar. Movimiento angular, bilateral y simétrico.</w:t>
+              <w:t>Movimiento angular, unilateral y de cadena cinética abierta: extensión de cadera con flexión de rodilla (armado de la pierna) seguida de flexión de cadera con extensión de rodilla (golpeo), con el tobillo en flexión plantar.</w:t>
             </w:r>
           </w:p>
         </w:tc>
@@ -2020,7 +2020,7 @@
                 <w:color w:val="1F3A8A"/>
                 <w:sz w:val="20"/>
               </w:rPr>
-              <w:t>Agonistas: cuádriceps y glúteo mayor (concéntricos en el ascenso, excéntricos en el descenso). Antagonistas: isquiotibiales y flexores de cadera, según la articulación y la fase. Sinergistas: aductores y gastrocnemio. Estabilizadores: erectores espinales, abdominales y sóleo.</w:t>
+              <w:t>Agonistas: iliopsoas, recto femoral y cuádriceps en el golpeo (concéntricos). Antagonistas: isquiotibiales y glúteo mayor, que frenan la pierna al final del movimiento (excéntricos). Sinergistas: sartorio y tensor de la fascia lata. Estabilizadores: glúteo medio, abdominales y músculos de la pierna de apoyo.</w:t>
             </w:r>
           </w:p>
         </w:tc>
@@ -2050,7 +2050,7 @@
                 <w:color w:val="1F3A8A"/>
                 <w:sz w:val="20"/>
               </w:rPr>
-              <w:t>Ejercicio base para fortalecer miembros inferiores y core, mejorar la fuerza para saltar, correr y cambiar de dirección, y prevenir lesiones. Se enseña con pies a la anchura de hombros, espalda neutra, rodillas alineadas con los pies y descenso controlado; se progresa de peso corporal a carga externa y se adapta con sentadilla en pared o con apoyo para principiantes.</w:t>
+              <w:t>Sirve para enseñar fútbol y deportes con golpeo, trabajar fuerza y flexibilidad de miembros inferiores y mejorar el equilibrio sobre un solo apoyo. Se enseña con pie de apoyo junto al balón, pierna de golpeo armada atrás, contacto con el empeine y seguimiento del movimiento; el calentamiento debe incluir isquiotibiales y flexores de cadera para prevenir distensiones, y se progresa de pase corto a tiro con más potencia.</w:t>
             </w:r>
           </w:p>
         </w:tc>

</xml_diff>

<commit_message>
Use a different movement in each activity (throw, squat, vertical jump, kick)
Co-Authored-By: Claude Sonnet 5.5 <noreply@anthropic.com>
Claude-Session: https://claude.ai/code/session_01W5ytguvUBBGTyHeCH4M5HD
</commit_message>
<xml_diff>
--- a/Taller_Bases_Biologicas_Anatomicas_RESUELTO.docx
+++ b/Taller_Bases_Biologicas_Anatomicas_RESUELTO.docx
@@ -930,7 +930,7 @@
           <w:b w:val="0"/>
           <w:color w:val="1F3A8A"/>
         </w:rPr>
-        <w:t>Sentadilla (squat) con peso corporal</w:t>
+        <w:t>Lanzamiento de balón por encima del hombro</w:t>
       </w:r>
     </w:p>
     <w:p>
@@ -944,7 +944,7 @@
           <w:b w:val="0"/>
           <w:color w:val="1F3A8A"/>
         </w:rPr>
-        <w:t>Cadera (coxofemoral), rodilla (tibiofemoral y femororrotuliana) y tobillo (tibioastragalina). La columna lumbar actúa de forma estabilizadora.</w:t>
+        <w:t>Glenohumeral (hombro), escapulotorácica, codo (humerocubital y humerorradial), radiocubitales y muñeca; el tronco (columna) y la cadera aportan rotación y transmiten la fuerza desde las piernas.</w:t>
       </w:r>
     </w:p>
     <w:p>
@@ -958,7 +958,7 @@
           <w:b w:val="0"/>
           <w:color w:val="1F3A8A"/>
         </w:rPr>
-        <w:t>Cuádriceps, glúteo mayor, isquiotibiales y aductores (extensión de cadera y rodilla en el ascenso); gastrocnemio y sóleo (estabilización del tobillo); erectores de la columna y abdominales (estabilizan el tronco).</w:t>
+        <w:t>Pectoral mayor, dorsal ancho, deltoides anterior, subescapular, serrato anterior y tríceps braquial; los oblicuos y el core rotan y estabilizan el tronco.</w:t>
       </w:r>
     </w:p>
     <w:p>
@@ -972,7 +972,7 @@
           <w:b w:val="0"/>
           <w:color w:val="1F3A8A"/>
         </w:rPr>
-        <w:t>Fémur, tibia, peroné, rótula, huesos del tarso (astrágalo, calcáneo), pelvis (coxal y sacro) y columna vertebral (lumbar).</w:t>
+        <w:t>Húmero, escápula, clavícula, radio, cúbito, huesos de la mano (carpianos, metacarpianos y falanges), columna vertebral, costillas y pelvis.</w:t>
       </w:r>
     </w:p>
     <w:p>
@@ -986,7 +986,7 @@
           <w:b w:val="0"/>
           <w:color w:val="1F3A8A"/>
         </w:rPr>
-        <w:t>Plano sagital (el movimiento ocurre de adelante hacia atrás, dividiendo el cuerpo en derecha e izquierda).</w:t>
+        <w:t>Principalmente plano sagital (flexión de hombro y extensión de codo al lanzar), con componente del plano transversal por la rotación del tronco y del hombro.</w:t>
       </w:r>
     </w:p>
     <w:p>
@@ -1000,7 +1000,7 @@
           <w:b w:val="0"/>
           <w:color w:val="1F3A8A"/>
         </w:rPr>
-        <w:t>Eje transversal (de derecha a izquierda), alrededor del cual se flexionan y extienden cadera, rodilla y tobillo.</w:t>
+        <w:t>Eje transversal (flexión de hombro y extensión de codo) y eje longitudinal (rotación de tronco y rotación interna del hombro).</w:t>
       </w:r>
     </w:p>
     <w:p>
@@ -1014,7 +1014,7 @@
           <w:b w:val="0"/>
           <w:color w:val="1F3A8A"/>
         </w:rPr>
-        <w:t>En la fase de ascenso (concéntrica): cuádriceps (extensión de rodilla) y glúteo mayor con isquiotibiales (extensión de cadera); en el descenso actúan de forma excéntrica controlando la bajada.</w:t>
+        <w:t>En la fase de aceleración (concéntrica): pectoral mayor, dorsal ancho y deltoides anterior (flexión y aducción del hombro), subescapular (rotación interna) y tríceps braquial (extensión del codo).</w:t>
       </w:r>
     </w:p>
     <w:p>
@@ -1028,7 +1028,7 @@
           <w:b w:val="0"/>
           <w:color w:val="1F3A8A"/>
         </w:rPr>
-        <w:t>Isquiotibiales (bíceps femoral, semitendinoso y semimembranoso) respecto a la rodilla, y los flexores de cadera (iliopsoas, recto femoral) respecto al glúteo mayor; en el tobillo, el tibial anterior frente al gastrocnemio/sóleo. En el descenso el antagonista es el que se alarga controlando el movimiento.</w:t>
+        <w:t>Deltoides posterior, infraespinoso y redondo menor (rotación externa, frenan el brazo en el seguimiento), trapecio medio y romboides (retracción escapular) y bíceps braquial (frena la extensión del codo).</w:t>
       </w:r>
     </w:p>
     <w:p>
@@ -1599,7 +1599,7 @@
           <w:b w:val="0"/>
           <w:color w:val="1F3A8A"/>
         </w:rPr>
-        <w:t>Fémur, tibia, peroné, rótula, pelvis, columna lumbar y huesos del tarso (astrágalo, calcáneo).</w:t>
+        <w:t>Pelvis, fémur, rótula, tibia, peroné y huesos del pie (astrágalo, calcáneo y metatarsianos).</w:t>
       </w:r>
     </w:p>
     <w:p>
@@ -1611,7 +1611,7 @@
           <w:b w:val="0"/>
           <w:color w:val="1F3A8A"/>
         </w:rPr>
-        <w:t>Cadera (coxofemoral), rodilla (tibiofemoral y femororrotuliana) y tobillo (tibioastragalina).</w:t>
+        <w:t>Cadera (coxofemoral), rodilla (tibiofemoral) y tobillo (tibioastragalina).</w:t>
       </w:r>
     </w:p>
     <w:p>
@@ -1623,7 +1623,7 @@
           <w:b w:val="0"/>
           <w:color w:val="1F3A8A"/>
         </w:rPr>
-        <w:t>Cuádriceps, glúteo mayor, isquiotibiales, aductores, gastrocnemio, sóleo y erectores espinales/abdominales.</w:t>
+        <w:t>Cuádriceps, glúteo mayor, isquiotibiales, gastrocnemio y sóleo (más abdominales y erectores espinales como estabilizadores).</w:t>
       </w:r>
     </w:p>
     <w:p>
@@ -1659,7 +1659,7 @@
           <w:b w:val="0"/>
           <w:color w:val="1F3A8A"/>
         </w:rPr>
-        <w:t>Flexión (descenso) y extensión (ascenso) de cadera y rodilla, con dorsiflexión y flexión plantar del tobillo.</w:t>
+        <w:t>Salto vertical: flexión de cadera, rodilla y tobillo (dorsiflexión) en la preparación, seguida de extensión de cadera y rodilla con flexión plantar del tobillo en el despegue.</w:t>
       </w:r>
     </w:p>
     <w:p>

</xml_diff>